<commit_message>
fixed bug to display help in phipml-plot
</commit_message>
<xml_diff>
--- a/explain_metrics.docx
+++ b/explain_metrics.docx
@@ -146,7 +146,7 @@
               <w:tl2br w:val="nil" w:sz="0" w:space="0" w:color="000000" tmln="20, 20, 20, 0, 0"/>
               <w:tr2bl w:val="nil" w:sz="0" w:space="0" w:color="000000" tmln="20, 20, 20, 0, 0"/>
             </w:tcBorders>
-            <w:tmTcPr id="1786624415" protected="0"/>
+            <w:tmTcPr id="1786973729" protected="0"/>
           </w:tcPr>
           <w:p>
             <w:pPr>
@@ -198,7 +198,7 @@
               <w:tl2br w:val="nil" w:sz="0" w:space="0" w:color="000000" tmln="20, 20, 20, 0, 0"/>
               <w:tr2bl w:val="nil" w:sz="0" w:space="0" w:color="000000" tmln="20, 20, 20, 0, 0"/>
             </w:tcBorders>
-            <w:tmTcPr id="1786624415" protected="0"/>
+            <w:tmTcPr id="1786973729" protected="0"/>
           </w:tcPr>
           <w:p>
             <w:pPr>
@@ -250,7 +250,7 @@
               <w:tl2br w:val="nil" w:sz="0" w:space="0" w:color="000000" tmln="20, 20, 20, 0, 0"/>
               <w:tr2bl w:val="nil" w:sz="0" w:space="0" w:color="000000" tmln="20, 20, 20, 0, 0"/>
             </w:tcBorders>
-            <w:tmTcPr id="1786624415" protected="0"/>
+            <w:tmTcPr id="1786973729" protected="0"/>
           </w:tcPr>
           <w:p>
             <w:pPr>
@@ -309,7 +309,7 @@
               <w:tl2br w:val="nil" w:sz="0" w:space="0" w:color="000000" tmln="20, 20, 20, 0, 0"/>
               <w:tr2bl w:val="nil" w:sz="0" w:space="0" w:color="000000" tmln="20, 20, 20, 0, 0"/>
             </w:tcBorders>
-            <w:tmTcPr id="1786624415" protected="0"/>
+            <w:tmTcPr id="1786973729" protected="0"/>
           </w:tcPr>
           <w:p>
             <w:pPr>
@@ -361,7 +361,7 @@
               <w:tl2br w:val="nil" w:sz="0" w:space="0" w:color="000000" tmln="20, 20, 20, 0, 0"/>
               <w:tr2bl w:val="nil" w:sz="0" w:space="0" w:color="000000" tmln="20, 20, 20, 0, 0"/>
             </w:tcBorders>
-            <w:tmTcPr id="1786624415" protected="0"/>
+            <w:tmTcPr id="1786973729" protected="0"/>
           </w:tcPr>
           <w:p>
             <w:pPr>
@@ -413,7 +413,7 @@
               <w:tl2br w:val="nil" w:sz="0" w:space="0" w:color="000000" tmln="20, 20, 20, 0, 0"/>
               <w:tr2bl w:val="nil" w:sz="0" w:space="0" w:color="000000" tmln="20, 20, 20, 0, 0"/>
             </w:tcBorders>
-            <w:tmTcPr id="1786624415" protected="0"/>
+            <w:tmTcPr id="1786973729" protected="0"/>
           </w:tcPr>
           <w:p>
             <w:pPr>
@@ -472,7 +472,7 @@
               <w:tl2br w:val="nil" w:sz="0" w:space="0" w:color="000000" tmln="20, 20, 20, 0, 0"/>
               <w:tr2bl w:val="nil" w:sz="0" w:space="0" w:color="000000" tmln="20, 20, 20, 0, 0"/>
             </w:tcBorders>
-            <w:tmTcPr id="1786624415" protected="0"/>
+            <w:tmTcPr id="1786973729" protected="0"/>
           </w:tcPr>
           <w:p>
             <w:pPr>
@@ -524,7 +524,7 @@
               <w:tl2br w:val="nil" w:sz="0" w:space="0" w:color="000000" tmln="20, 20, 20, 0, 0"/>
               <w:tr2bl w:val="nil" w:sz="0" w:space="0" w:color="000000" tmln="20, 20, 20, 0, 0"/>
             </w:tcBorders>
-            <w:tmTcPr id="1786624415" protected="0"/>
+            <w:tmTcPr id="1786973729" protected="0"/>
           </w:tcPr>
           <w:p>
             <w:pPr>
@@ -576,7 +576,7 @@
               <w:tl2br w:val="nil" w:sz="0" w:space="0" w:color="000000" tmln="20, 20, 20, 0, 0"/>
               <w:tr2bl w:val="nil" w:sz="0" w:space="0" w:color="000000" tmln="20, 20, 20, 0, 0"/>
             </w:tcBorders>
-            <w:tmTcPr id="1786624415" protected="0"/>
+            <w:tmTcPr id="1786973729" protected="0"/>
           </w:tcPr>
           <w:p>
             <w:pPr>
@@ -635,7 +635,7 @@
               <w:tl2br w:val="nil" w:sz="0" w:space="0" w:color="000000" tmln="20, 20, 20, 0, 0"/>
               <w:tr2bl w:val="nil" w:sz="0" w:space="0" w:color="000000" tmln="20, 20, 20, 0, 0"/>
             </w:tcBorders>
-            <w:tmTcPr id="1786624415" protected="0"/>
+            <w:tmTcPr id="1786973729" protected="0"/>
           </w:tcPr>
           <w:p>
             <w:pPr>
@@ -687,7 +687,7 @@
               <w:tl2br w:val="nil" w:sz="0" w:space="0" w:color="000000" tmln="20, 20, 20, 0, 0"/>
               <w:tr2bl w:val="nil" w:sz="0" w:space="0" w:color="000000" tmln="20, 20, 20, 0, 0"/>
             </w:tcBorders>
-            <w:tmTcPr id="1786624415" protected="0"/>
+            <w:tmTcPr id="1786973729" protected="0"/>
           </w:tcPr>
           <w:p>
             <w:pPr>
@@ -739,7 +739,7 @@
               <w:tl2br w:val="nil" w:sz="0" w:space="0" w:color="000000" tmln="20, 20, 20, 0, 0"/>
               <w:tr2bl w:val="nil" w:sz="0" w:space="0" w:color="000000" tmln="20, 20, 20, 0, 0"/>
             </w:tcBorders>
-            <w:tmTcPr id="1786624415" protected="0"/>
+            <w:tmTcPr id="1786973729" protected="0"/>
           </w:tcPr>
           <w:p>
             <w:pPr>
@@ -798,7 +798,7 @@
               <w:tl2br w:val="nil" w:sz="0" w:space="0" w:color="000000" tmln="20, 20, 20, 0, 0"/>
               <w:tr2bl w:val="nil" w:sz="0" w:space="0" w:color="000000" tmln="20, 20, 20, 0, 0"/>
             </w:tcBorders>
-            <w:tmTcPr id="1786624415" protected="0"/>
+            <w:tmTcPr id="1786973729" protected="0"/>
           </w:tcPr>
           <w:p>
             <w:pPr>
@@ -850,7 +850,7 @@
               <w:tl2br w:val="nil" w:sz="0" w:space="0" w:color="000000" tmln="20, 20, 20, 0, 0"/>
               <w:tr2bl w:val="nil" w:sz="0" w:space="0" w:color="000000" tmln="20, 20, 20, 0, 0"/>
             </w:tcBorders>
-            <w:tmTcPr id="1786624415" protected="0"/>
+            <w:tmTcPr id="1786973729" protected="0"/>
           </w:tcPr>
           <w:p>
             <w:pPr>
@@ -902,7 +902,7 @@
               <w:tl2br w:val="nil" w:sz="0" w:space="0" w:color="000000" tmln="20, 20, 20, 0, 0"/>
               <w:tr2bl w:val="nil" w:sz="0" w:space="0" w:color="000000" tmln="20, 20, 20, 0, 0"/>
             </w:tcBorders>
-            <w:tmTcPr id="1786624415" protected="0"/>
+            <w:tmTcPr id="1786973729" protected="0"/>
           </w:tcPr>
           <w:p>
             <w:pPr>
@@ -2567,6 +2567,181 @@
           <w:szCs w:val="26"/>
         </w:rPr>
         <w:t>The model correctly rejected 85% of the negative samples, while 15% were incorrectly classified as positive.</w:t>
+      </w:r>
+    </w:p>
+    <w:p>
+      <w:pPr>
+        <w:keepNext/>
+        <w:keepLines/>
+        <w:pBdr>
+          <w:top w:val="nil" w:sz="0" w:space="0" w:color="000000" tmln="20, 20, 20, 0, 0"/>
+          <w:left w:val="nil" w:sz="0" w:space="0" w:color="000000" tmln="20, 20, 20, 0, 0"/>
+          <w:bottom w:val="nil" w:sz="0" w:space="0" w:color="000000" tmln="20, 20, 20, 0, 0"/>
+          <w:right w:val="nil" w:sz="0" w:space="0" w:color="000000" tmln="20, 20, 20, 0, 0"/>
+          <w:between w:val="nil" w:sz="0" w:space="0" w:color="000000" tmln="20, 20, 20, 0, 0"/>
+        </w:pBdr>
+        <w:shd w:val="none"/>
+        <w:rPr>
+          <w:rFonts w:eastAsia="Basic Sans" w:cs="Basic Sans"/>
+          <w:b w:val="0"/>
+          <w:bCs/>
+          <w:sz w:val="20"/>
+          <w:szCs w:val="26"/>
+        </w:rPr>
+      </w:pPr>
+      <w:r>
+        <w:rPr>
+          <w:rFonts w:eastAsia="Basic Sans" w:cs="Basic Sans"/>
+          <w:b w:val="0"/>
+          <w:bCs/>
+          <w:sz w:val="20"/>
+          <w:szCs w:val="26"/>
+        </w:rPr>
+      </w:r>
+    </w:p>
+    <w:p>
+      <w:pPr>
+        <w:keepNext/>
+        <w:keepLines/>
+        <w:pBdr>
+          <w:top w:val="nil" w:sz="0" w:space="0" w:color="000000" tmln="20, 20, 20, 0, 0"/>
+          <w:left w:val="nil" w:sz="0" w:space="0" w:color="000000" tmln="20, 20, 20, 0, 0"/>
+          <w:bottom w:val="nil" w:sz="0" w:space="0" w:color="000000" tmln="20, 20, 20, 0, 0"/>
+          <w:right w:val="nil" w:sz="0" w:space="0" w:color="000000" tmln="20, 20, 20, 0, 0"/>
+          <w:between w:val="nil" w:sz="0" w:space="0" w:color="000000" tmln="20, 20, 20, 0, 0"/>
+        </w:pBdr>
+        <w:shd w:val="none"/>
+        <w:rPr>
+          <w:rFonts w:eastAsia="Basic Sans" w:cs="Basic Sans"/>
+          <w:b/>
+          <w:bCs/>
+          <w:sz w:val="28"/>
+          <w:szCs w:val="28"/>
+        </w:rPr>
+      </w:pPr>
+      <w:r>
+        <w:rPr>
+          <w:rFonts w:eastAsia="Basic Sans" w:cs="Basic Sans"/>
+          <w:b/>
+          <w:bCs/>
+          <w:sz w:val="28"/>
+          <w:szCs w:val="28"/>
+        </w:rPr>
+        <w:t>Negative predictive value (opposite to precision):</w:t>
+      </w:r>
+    </w:p>
+    <w:p>
+      <w:pPr>
+        <w:pBdr>
+          <w:top w:val="nil" w:sz="0" w:space="0" w:color="000000" tmln="20, 20, 20, 0, 0"/>
+          <w:left w:val="nil" w:sz="0" w:space="0" w:color="000000" tmln="20, 20, 20, 0, 0"/>
+          <w:bottom w:val="nil" w:sz="0" w:space="0" w:color="000000" tmln="20, 20, 20, 0, 0"/>
+          <w:right w:val="nil" w:sz="0" w:space="0" w:color="000000" tmln="20, 20, 20, 0, 0"/>
+          <w:between w:val="nil" w:sz="0" w:space="0" w:color="000000" tmln="20, 20, 20, 0, 0"/>
+        </w:pBdr>
+        <w:shd w:val="none"/>
+      </w:pPr>
+      <w:r>
+        <w:t>Among all samples predicted as negative, what proportion are actually negative?</w:t>
+      </w:r>
+    </w:p>
+    <w:p>
+      <w:pPr>
+        <w:pBdr>
+          <w:top w:val="nil" w:sz="0" w:space="0" w:color="000000" tmln="20, 20, 20, 0, 0"/>
+          <w:left w:val="nil" w:sz="0" w:space="0" w:color="000000" tmln="20, 20, 20, 0, 0"/>
+          <w:bottom w:val="nil" w:sz="0" w:space="0" w:color="000000" tmln="20, 20, 20, 0, 0"/>
+          <w:right w:val="nil" w:sz="0" w:space="0" w:color="000000" tmln="20, 20, 20, 0, 0"/>
+          <w:between w:val="nil" w:sz="0" w:space="0" w:color="000000" tmln="20, 20, 20, 0, 0"/>
+        </w:pBdr>
+        <w:shd w:val="none"/>
+      </w:pPr>
+      <w:r>
+        <w:t xml:space="preserve">NPV=TN/FN+TN​</w:t>
+      </w:r>
+    </w:p>
+    <w:p>
+      <w:pPr>
+        <w:keepNext/>
+        <w:keepLines/>
+        <w:pBdr>
+          <w:top w:val="nil" w:sz="0" w:space="0" w:color="000000" tmln="20, 20, 20, 0, 0"/>
+          <w:left w:val="nil" w:sz="0" w:space="0" w:color="000000" tmln="20, 20, 20, 0, 0"/>
+          <w:bottom w:val="nil" w:sz="0" w:space="0" w:color="000000" tmln="20, 20, 20, 0, 0"/>
+          <w:right w:val="nil" w:sz="0" w:space="0" w:color="000000" tmln="20, 20, 20, 0, 0"/>
+          <w:between w:val="nil" w:sz="0" w:space="0" w:color="000000" tmln="20, 20, 20, 0, 0"/>
+        </w:pBdr>
+        <w:shd w:val="none"/>
+        <w:rPr>
+          <w:rFonts w:eastAsia="Basic Sans" w:cs="Basic Sans"/>
+          <w:b/>
+          <w:bCs/>
+          <w:sz w:val="20"/>
+          <w:szCs w:val="26"/>
+        </w:rPr>
+      </w:pPr>
+      <w:r>
+        <w:rPr>
+          <w:rFonts w:eastAsia="Basic Sans" w:cs="Basic Sans"/>
+          <w:b/>
+          <w:bCs/>
+          <w:sz w:val="20"/>
+          <w:szCs w:val="26"/>
+        </w:rPr>
+      </w:r>
+    </w:p>
+    <w:p>
+      <w:pPr>
+        <w:pBdr>
+          <w:top w:val="nil" w:sz="0" w:space="0" w:color="000000" tmln="20, 20, 20, 0, 0"/>
+          <w:left w:val="nil" w:sz="0" w:space="0" w:color="000000" tmln="20, 20, 20, 0, 0"/>
+          <w:bottom w:val="nil" w:sz="0" w:space="0" w:color="000000" tmln="20, 20, 20, 0, 0"/>
+          <w:right w:val="nil" w:sz="0" w:space="0" w:color="000000" tmln="20, 20, 20, 0, 0"/>
+          <w:between w:val="nil" w:sz="0" w:space="0" w:color="000000" tmln="20, 20, 20, 0, 0"/>
+        </w:pBdr>
+        <w:shd w:val="none"/>
+      </w:pPr>
+      <w:r>
+        <w:t xml:space="preserve">So approximately </w:t>
+      </w:r>
+      <w:r>
+        <w:rPr>
+          <w:b/>
+        </w:rPr>
+        <w:t>X% of samples classified as negative are truly negative</w:t>
+      </w:r>
+      <w:r>
+        <w:t>.</w:t>
+      </w:r>
+    </w:p>
+    <w:p>
+      <w:pPr>
+        <w:keepNext/>
+        <w:keepLines/>
+        <w:pBdr>
+          <w:top w:val="nil" w:sz="0" w:space="0" w:color="000000" tmln="20, 20, 20, 0, 0"/>
+          <w:left w:val="nil" w:sz="0" w:space="0" w:color="000000" tmln="20, 20, 20, 0, 0"/>
+          <w:bottom w:val="nil" w:sz="0" w:space="0" w:color="000000" tmln="20, 20, 20, 0, 0"/>
+          <w:right w:val="nil" w:sz="0" w:space="0" w:color="000000" tmln="20, 20, 20, 0, 0"/>
+          <w:between w:val="nil" w:sz="0" w:space="0" w:color="000000" tmln="20, 20, 20, 0, 0"/>
+        </w:pBdr>
+        <w:shd w:val="none"/>
+        <w:rPr>
+          <w:rFonts w:eastAsia="Basic Sans" w:cs="Basic Sans"/>
+          <w:b/>
+          <w:bCs/>
+          <w:sz w:val="20"/>
+          <w:szCs w:val="26"/>
+        </w:rPr>
+      </w:pPr>
+      <w:r>
+        <w:rPr>
+          <w:rFonts w:eastAsia="Basic Sans" w:cs="Basic Sans"/>
+          <w:b/>
+          <w:bCs/>
+          <w:sz w:val="20"/>
+          <w:szCs w:val="26"/>
+        </w:rPr>
       </w:r>
     </w:p>
     <w:p>

</xml_diff>